<commit_message>
Update Default Theme Design Lead and Dev Leads with official names and profiles
</commit_message>
<xml_diff>
--- a/WordPress-Theme-Contribution-Guide.docx
+++ b/WordPress-Theme-Contribution-Guide.docx
@@ -4182,7 +4182,7 @@
                 <w:sz w:val="22"/>
                 <w:szCs w:val="22"/>
               </w:rPr>
-              <w:t xml:space="preserve">Ipsum is the new default theme shipping with WordPress 7.2 (WordPress has officially moved away from year-based theme names). Lead designer: @iamarinoh. Co-lead developers: @onemaggie and @poena. Lead mentor: @juanfra.</w:t>
+              <w:t xml:space="preserve">Ipsum is the new default theme shipping with WordPress 7.2. Design Lead: Henrique Iamarino (@iamarinoh). Dev Leads: Maggie Cabrera (@onemaggie), Carolina Nymark (@poena). Lead Mentor: Juanfra Aldasoro (@juanfra).</w:t>
             </w:r>
           </w:p>
         </w:tc>
@@ -6401,7 +6401,7 @@
                 <w:sz w:val="22"/>
                 <w:szCs w:val="22"/>
               </w:rPr>
-              <w:t xml:space="preserve">💡  Ipsum Team: @iamarinoh (Lead Designer), @onemaggie and @poena (Co-Lead Developers), @juanfra (Lead Mentor). Join #themes on Slack!</w:t>
+              <w:t xml:space="preserve">💡  Ipsum Team: Henrique Iamarino (Design Lead), Maggie Cabrera &amp; Carolina Nymark (Dev Leads), Juanfra Aldasoro (Lead Mentor). Join #themes on Slack!</w:t>
             </w:r>
           </w:p>
         </w:tc>

</xml_diff>